<commit_message>
ToB v1.11: add 14-day termination with full refund subject to 50% fair-use cap; replace 1.2x overage charging with no-overage promise, one-hour monthly buffer and tier upgrade on two consecutive overruns
</commit_message>
<xml_diff>
--- a/downloads/keepcounsel-terms-of-business.docx
+++ b/downloads/keepcounsel-terms-of-business.docx
@@ -91,7 +91,7 @@
           <w:color w:val="595959"/>
           <w:sz w:val="18"/>
         </w:rPr>
-        <w:t>Version 1.10 — September 2026 · Charlie Bravo Services Limited, trading as KeepCounsel · Company No. 11163105</w:t>
+        <w:t>Version 1.11 — September 2026 · Charlie Bravo Services Limited, trading as KeepCounsel · Company No. 11163105</w:t>
       </w:r>
     </w:p>
     <w:p>
@@ -920,7 +920,7 @@
           <w:color w:val="333333"/>
           <w:sz w:val="21"/>
         </w:rPr>
-        <w:t xml:space="preserve"> Charges are billed monthly in advance, for the number of hours stated in the Order Form. Time is recorded in 15-minute increments. Retainers carry an Initial Period of not less than three months. Where the Order Form for a retainer tier provides for hours to roll over, unused hours in a given month roll over once, into the following month, assuming there is an ongoing and chargeable monthly retainer in the relevant subsequent month; if the retainer ends, or is not renewed, at the end of a month, any unused hours from that final month are not carried over and do not give rise to any credit or refund. Hours used in a month in excess of those included in the Order Form are charged as additional hours at 1.2 times the hourly rate applicable to that retainer tier — for example, an hourly rate of £180 becomes £216, £170 becomes £204, £160 becomes £192, and £150 becomes £180. After the Initial Period, the retainer continues on a rolling monthly basis until terminated in accordance with Clause 9.</w:t>
+        <w:t xml:space="preserve"> Charges are billed monthly in advance, for the number of hours stated in the Order Form. Time is recorded in 15-minute increments. Retainers carry an Initial Period of not less than three months. Notwithstanding that Initial Period, the Customer may terminate the retainer by written notice given within 14 days of the Effective Date, and KeepCounsel will refund the Charges paid for the first month in full, provided that no more than 50% of the hours included for that month have been used as at the date of that notice. Where the Order Form for a retainer tier provides for hours to roll over, unused hours in a given month roll over once, into the following month, assuming there is an ongoing and chargeable monthly retainer in the relevant subsequent month; if the retainer ends, or is not renewed, at the end of a month, any unused hours from that final month are not carried over and do not give rise to any credit or refund. KeepCounsel does not charge additional fees for hours used in excess of those included in the Order Form: the Customer may exceed the included hours by up to one hour in any month at no charge. Where the included hours are exceeded in two consecutive months, KeepCounsel may, on written notice, move the Customer to the next retainer tier with effect from the start of the following month, unless the parties instead agree a separate scope of work for the additional requirement. After the Initial Period, the retainer continues on a rolling monthly basis until terminated in accordance with Clause 9.</w:t>
       </w:r>
     </w:p>
     <w:p>

</xml_diff>